<commit_message>
feat: add booking service with i18n and unit tests
</commit_message>
<xml_diff>
--- a/Day 8/docs/TECHNICAL_DOCUMENTATION.docx
+++ b/Day 8/docs/TECHNICAL_DOCUMENTATION.docx
@@ -569,7 +569,7 @@
           <w:szCs w:val="28"/>
         </w:rPr>
         <w:lastRenderedPageBreak/>
-        <w:t>1. Введение</w:t>
+        <w:t>1. ВВЕДЕНИЕ</w:t>
       </w:r>
     </w:p>
     <w:p>
@@ -889,26 +889,87 @@
     <w:p>
       <w:pPr>
         <w:spacing w:line="360" w:lineRule="auto"/>
-        <w:ind w:firstLine="709"/>
-        <w:jc w:val="both"/>
-        <w:rPr>
-          <w:rFonts w:ascii="Times New Roman" w:hAnsi="Times New Roman" w:cs="Times New Roman"/>
-          <w:b/>
-          <w:bCs/>
-          <w:color w:val="0D0D0D" w:themeColor="text1" w:themeTint="F2"/>
-          <w:sz w:val="28"/>
-          <w:szCs w:val="28"/>
-        </w:rPr>
-      </w:pPr>
-      <w:r>
-        <w:rPr>
-          <w:rFonts w:ascii="Times New Roman" w:hAnsi="Times New Roman" w:cs="Times New Roman"/>
-          <w:b/>
-          <w:bCs/>
-          <w:color w:val="0D0D0D" w:themeColor="text1" w:themeTint="F2"/>
-          <w:sz w:val="28"/>
-          <w:szCs w:val="28"/>
-        </w:rPr>
+        <w:jc w:val="both"/>
+        <w:rPr>
+          <w:rFonts w:ascii="Times New Roman" w:hAnsi="Times New Roman" w:cs="Times New Roman"/>
+          <w:color w:val="0D0D0D" w:themeColor="text1" w:themeTint="F2"/>
+          <w:sz w:val="28"/>
+          <w:szCs w:val="28"/>
+        </w:rPr>
+      </w:pPr>
+    </w:p>
+    <w:p>
+      <w:pPr>
+        <w:spacing w:line="360" w:lineRule="auto"/>
+        <w:jc w:val="both"/>
+        <w:rPr>
+          <w:rFonts w:ascii="Times New Roman" w:hAnsi="Times New Roman" w:cs="Times New Roman"/>
+          <w:color w:val="0D0D0D" w:themeColor="text1" w:themeTint="F2"/>
+          <w:sz w:val="28"/>
+          <w:szCs w:val="28"/>
+        </w:rPr>
+      </w:pPr>
+    </w:p>
+    <w:p>
+      <w:pPr>
+        <w:spacing w:line="360" w:lineRule="auto"/>
+        <w:jc w:val="both"/>
+        <w:rPr>
+          <w:rFonts w:ascii="Times New Roman" w:hAnsi="Times New Roman" w:cs="Times New Roman"/>
+          <w:color w:val="0D0D0D" w:themeColor="text1" w:themeTint="F2"/>
+          <w:sz w:val="28"/>
+          <w:szCs w:val="28"/>
+        </w:rPr>
+      </w:pPr>
+    </w:p>
+    <w:p>
+      <w:pPr>
+        <w:spacing w:line="360" w:lineRule="auto"/>
+        <w:jc w:val="both"/>
+        <w:rPr>
+          <w:rFonts w:ascii="Times New Roman" w:hAnsi="Times New Roman" w:cs="Times New Roman"/>
+          <w:color w:val="0D0D0D" w:themeColor="text1" w:themeTint="F2"/>
+          <w:sz w:val="28"/>
+          <w:szCs w:val="28"/>
+        </w:rPr>
+      </w:pPr>
+    </w:p>
+    <w:p>
+      <w:pPr>
+        <w:spacing w:line="360" w:lineRule="auto"/>
+        <w:jc w:val="both"/>
+        <w:rPr>
+          <w:rFonts w:ascii="Times New Roman" w:hAnsi="Times New Roman" w:cs="Times New Roman"/>
+          <w:color w:val="0D0D0D" w:themeColor="text1" w:themeTint="F2"/>
+          <w:sz w:val="28"/>
+          <w:szCs w:val="28"/>
+        </w:rPr>
+      </w:pPr>
+    </w:p>
+    <w:p>
+      <w:pPr>
+        <w:spacing w:line="360" w:lineRule="auto"/>
+        <w:ind w:firstLine="709"/>
+        <w:jc w:val="both"/>
+        <w:rPr>
+          <w:rFonts w:ascii="Times New Roman" w:hAnsi="Times New Roman" w:cs="Times New Roman"/>
+          <w:b/>
+          <w:bCs/>
+          <w:color w:val="0D0D0D" w:themeColor="text1" w:themeTint="F2"/>
+          <w:sz w:val="28"/>
+          <w:szCs w:val="28"/>
+        </w:rPr>
+      </w:pPr>
+      <w:r>
+        <w:rPr>
+          <w:rFonts w:ascii="Times New Roman" w:hAnsi="Times New Roman" w:cs="Times New Roman"/>
+          <w:b/>
+          <w:bCs/>
+          <w:color w:val="0D0D0D" w:themeColor="text1" w:themeTint="F2"/>
+          <w:sz w:val="28"/>
+          <w:szCs w:val="28"/>
+        </w:rPr>
+        <w:lastRenderedPageBreak/>
         <w:t>4. Требования к программе</w:t>
       </w:r>
     </w:p>
@@ -1035,7 +1096,6 @@
           <w:sz w:val="28"/>
           <w:szCs w:val="28"/>
         </w:rPr>
-        <w:lastRenderedPageBreak/>
         <w:t xml:space="preserve">добавление клиентов; </w:t>
       </w:r>
     </w:p>
@@ -1410,6 +1470,7 @@
           <w:sz w:val="28"/>
           <w:szCs w:val="28"/>
         </w:rPr>
+        <w:lastRenderedPageBreak/>
         <w:t xml:space="preserve">руководство пользователя; </w:t>
       </w:r>
     </w:p>
@@ -1512,7 +1573,6 @@
           <w:sz w:val="28"/>
           <w:szCs w:val="28"/>
         </w:rPr>
-        <w:lastRenderedPageBreak/>
         <w:t>6. Технико-экономические показатели</w:t>
       </w:r>
     </w:p>
@@ -1916,13 +1976,38 @@
           <w:sz w:val="28"/>
           <w:szCs w:val="28"/>
         </w:rPr>
+        <w:lastRenderedPageBreak/>
         <w:t>Программа считается принятой при успешном выполнении всех функций.</w:t>
       </w:r>
     </w:p>
-    <w:p/>
-    <w:p/>
-    <w:p/>
-    <w:p/>
+    <w:p>
+      <w:pPr>
+        <w:spacing w:line="360" w:lineRule="auto"/>
+        <w:jc w:val="both"/>
+        <w:rPr>
+          <w:rFonts w:ascii="Times New Roman" w:hAnsi="Times New Roman" w:cs="Times New Roman"/>
+          <w:sz w:val="28"/>
+          <w:szCs w:val="28"/>
+        </w:rPr>
+      </w:pPr>
+    </w:p>
+    <w:p>
+      <w:pPr>
+        <w:spacing w:line="360" w:lineRule="auto"/>
+        <w:jc w:val="both"/>
+        <w:rPr>
+          <w:rFonts w:ascii="Times New Roman" w:hAnsi="Times New Roman" w:cs="Times New Roman"/>
+          <w:sz w:val="28"/>
+          <w:szCs w:val="28"/>
+        </w:rPr>
+      </w:pPr>
+    </w:p>
+    <w:p>
+      <w:pPr>
+        <w:spacing w:line="360" w:lineRule="auto"/>
+        <w:jc w:val="both"/>
+      </w:pPr>
+    </w:p>
     <w:p>
       <w:pPr>
         <w:spacing w:line="360" w:lineRule="auto"/>
@@ -1945,7 +2030,6 @@
           <w:sz w:val="28"/>
           <w:szCs w:val="28"/>
         </w:rPr>
-        <w:lastRenderedPageBreak/>
         <w:t>МИНИСТЕРСТВО ЛЕСНОГО ХОЗЯЙСТВА</w:t>
       </w:r>
     </w:p>
@@ -2413,6 +2497,7 @@
           <w:sz w:val="28"/>
           <w:szCs w:val="28"/>
         </w:rPr>
+        <w:lastRenderedPageBreak/>
         <w:t>преподаватель</w:t>
       </w:r>
     </w:p>
@@ -2494,54 +2579,26 @@
     <w:p>
       <w:pPr>
         <w:spacing w:line="360" w:lineRule="auto"/>
-        <w:jc w:val="center"/>
-        <w:rPr>
-          <w:rStyle w:val="Emphasis"/>
-          <w:rFonts w:ascii="Times New Roman" w:hAnsi="Times New Roman" w:cs="Times New Roman"/>
-          <w:i w:val="0"/>
-          <w:iCs w:val="0"/>
-          <w:sz w:val="28"/>
-          <w:szCs w:val="28"/>
-        </w:rPr>
-      </w:pPr>
-    </w:p>
-    <w:p>
-      <w:pPr>
-        <w:spacing w:line="360" w:lineRule="auto"/>
-        <w:ind w:firstLine="709"/>
-        <w:jc w:val="both"/>
-        <w:rPr>
-          <w:rFonts w:ascii="Times New Roman" w:hAnsi="Times New Roman" w:cs="Times New Roman"/>
-          <w:b/>
-          <w:bCs/>
-          <w:sz w:val="28"/>
-          <w:szCs w:val="28"/>
-        </w:rPr>
-      </w:pPr>
-      <w:r>
-        <w:rPr>
-          <w:rFonts w:ascii="Times New Roman" w:hAnsi="Times New Roman" w:cs="Times New Roman"/>
-          <w:b/>
-          <w:bCs/>
-          <w:sz w:val="28"/>
-          <w:szCs w:val="28"/>
-        </w:rPr>
-        <w:t>1. Назначение программы</w:t>
-      </w:r>
-    </w:p>
-    <w:p>
-      <w:pPr>
-        <w:spacing w:line="360" w:lineRule="auto"/>
-        <w:ind w:firstLine="709"/>
-        <w:jc w:val="both"/>
-        <w:rPr>
-          <w:rFonts w:ascii="Times New Roman" w:hAnsi="Times New Roman" w:cs="Times New Roman"/>
-          <w:b/>
-          <w:bCs/>
-          <w:sz w:val="28"/>
-          <w:szCs w:val="28"/>
-        </w:rPr>
-      </w:pPr>
+        <w:ind w:firstLine="709"/>
+        <w:jc w:val="both"/>
+        <w:rPr>
+          <w:rFonts w:ascii="Times New Roman" w:hAnsi="Times New Roman" w:cs="Times New Roman"/>
+          <w:b/>
+          <w:bCs/>
+          <w:sz w:val="28"/>
+          <w:szCs w:val="28"/>
+        </w:rPr>
+      </w:pPr>
+      <w:r>
+        <w:rPr>
+          <w:rFonts w:ascii="Times New Roman" w:hAnsi="Times New Roman" w:cs="Times New Roman"/>
+          <w:b/>
+          <w:bCs/>
+          <w:sz w:val="28"/>
+          <w:szCs w:val="28"/>
+        </w:rPr>
+        <w:t>1. НАЗНАЧЕНИЕ ПРОГРАММЫ</w:t>
+      </w:r>
     </w:p>
     <w:p>
       <w:pPr>
@@ -2952,6 +3009,7 @@
           <w:sz w:val="28"/>
           <w:szCs w:val="28"/>
         </w:rPr>
+        <w:lastRenderedPageBreak/>
         <w:t>4.3 Поиск клиента</w:t>
       </w:r>
     </w:p>
@@ -2974,30 +3032,6 @@
         </w:rPr>
         <w:t>В поле поиска ввести данные клиента и нажать кнопку «Найти».</w:t>
       </w:r>
-    </w:p>
-    <w:p>
-      <w:pPr>
-        <w:spacing w:line="360" w:lineRule="auto"/>
-        <w:ind w:firstLine="709"/>
-        <w:jc w:val="both"/>
-        <w:rPr>
-          <w:rFonts w:ascii="Times New Roman" w:hAnsi="Times New Roman" w:cs="Times New Roman"/>
-          <w:sz w:val="28"/>
-          <w:szCs w:val="28"/>
-        </w:rPr>
-      </w:pPr>
-    </w:p>
-    <w:p>
-      <w:pPr>
-        <w:spacing w:line="360" w:lineRule="auto"/>
-        <w:ind w:firstLine="709"/>
-        <w:jc w:val="both"/>
-        <w:rPr>
-          <w:rFonts w:ascii="Times New Roman" w:hAnsi="Times New Roman" w:cs="Times New Roman"/>
-          <w:sz w:val="28"/>
-          <w:szCs w:val="28"/>
-        </w:rPr>
-      </w:pPr>
     </w:p>
     <w:p>
       <w:pPr>
@@ -3113,37 +3147,18 @@
     </w:p>
     <w:tbl>
       <w:tblPr>
+        <w:tblStyle w:val="TableGrid"/>
         <w:tblW w:w="0" w:type="auto"/>
-        <w:tblCellSpacing w:w="15" w:type="dxa"/>
-        <w:tblBorders>
-          <w:top w:val="single" w:sz="4" w:space="0" w:color="auto"/>
-          <w:left w:val="single" w:sz="4" w:space="0" w:color="auto"/>
-          <w:bottom w:val="single" w:sz="4" w:space="0" w:color="auto"/>
-          <w:right w:val="single" w:sz="4" w:space="0" w:color="auto"/>
-          <w:insideH w:val="single" w:sz="4" w:space="0" w:color="auto"/>
-          <w:insideV w:val="single" w:sz="4" w:space="0" w:color="auto"/>
-        </w:tblBorders>
-        <w:tblCellMar>
-          <w:top w:w="15" w:type="dxa"/>
-          <w:left w:w="15" w:type="dxa"/>
-          <w:bottom w:w="15" w:type="dxa"/>
-          <w:right w:w="15" w:type="dxa"/>
-        </w:tblCellMar>
         <w:tblLook w:val="04A0" w:firstRow="1" w:lastRow="0" w:firstColumn="1" w:lastColumn="0" w:noHBand="0" w:noVBand="1"/>
       </w:tblPr>
       <w:tblGrid>
-        <w:gridCol w:w="4511"/>
-        <w:gridCol w:w="4452"/>
+        <w:gridCol w:w="4613"/>
+        <w:gridCol w:w="4573"/>
       </w:tblGrid>
       <w:tr>
-        <w:trPr>
-          <w:tblHeader/>
-          <w:tblCellSpacing w:w="15" w:type="dxa"/>
-        </w:trPr>
         <w:tc>
           <w:tcPr>
-            <w:tcW w:w="0" w:type="auto"/>
-            <w:vAlign w:val="center"/>
+            <w:tcW w:w="4613" w:type="dxa"/>
             <w:hideMark/>
           </w:tcPr>
           <w:p>
@@ -3170,7 +3185,6 @@
         <w:tc>
           <w:tcPr>
             <w:tcW w:w="0" w:type="auto"/>
-            <w:vAlign w:val="center"/>
             <w:hideMark/>
           </w:tcPr>
           <w:p>
@@ -3196,13 +3210,9 @@
         </w:tc>
       </w:tr>
       <w:tr>
-        <w:trPr>
-          <w:tblCellSpacing w:w="15" w:type="dxa"/>
-        </w:trPr>
         <w:tc>
           <w:tcPr>
-            <w:tcW w:w="0" w:type="auto"/>
-            <w:vAlign w:val="center"/>
+            <w:tcW w:w="4613" w:type="dxa"/>
             <w:hideMark/>
           </w:tcPr>
           <w:p>
@@ -3229,7 +3239,6 @@
         <w:tc>
           <w:tcPr>
             <w:tcW w:w="0" w:type="auto"/>
-            <w:vAlign w:val="center"/>
             <w:hideMark/>
           </w:tcPr>
           <w:p>
@@ -3255,13 +3264,9 @@
         </w:tc>
       </w:tr>
       <w:tr>
-        <w:trPr>
-          <w:tblCellSpacing w:w="15" w:type="dxa"/>
-        </w:trPr>
         <w:tc>
           <w:tcPr>
-            <w:tcW w:w="0" w:type="auto"/>
-            <w:vAlign w:val="center"/>
+            <w:tcW w:w="4613" w:type="dxa"/>
             <w:hideMark/>
           </w:tcPr>
           <w:p>
@@ -3288,7 +3293,6 @@
         <w:tc>
           <w:tcPr>
             <w:tcW w:w="0" w:type="auto"/>
-            <w:vAlign w:val="center"/>
             <w:hideMark/>
           </w:tcPr>
           <w:p>
@@ -3314,13 +3318,9 @@
         </w:tc>
       </w:tr>
       <w:tr>
-        <w:trPr>
-          <w:tblCellSpacing w:w="15" w:type="dxa"/>
-        </w:trPr>
         <w:tc>
           <w:tcPr>
-            <w:tcW w:w="0" w:type="auto"/>
-            <w:vAlign w:val="center"/>
+            <w:tcW w:w="4613" w:type="dxa"/>
             <w:hideMark/>
           </w:tcPr>
           <w:p>
@@ -3347,7 +3347,6 @@
         <w:tc>
           <w:tcPr>
             <w:tcW w:w="0" w:type="auto"/>
-            <w:vAlign w:val="center"/>
             <w:hideMark/>
           </w:tcPr>
           <w:p>
@@ -3417,16 +3416,540 @@
         <w:t>Для завершения работы необходимо закрыть окно программы стандартными средствами операционной системы.</w:t>
       </w:r>
     </w:p>
-    <w:p/>
-    <w:p>
-      <w:r>
-        <w:br w:type="page"/>
-      </w:r>
-    </w:p>
-    <w:p>
-      <w:pPr>
-        <w:spacing w:line="360" w:lineRule="auto"/>
-        <w:ind w:firstLine="709"/>
+    <w:p>
+      <w:pPr>
+        <w:jc w:val="both"/>
+      </w:pPr>
+    </w:p>
+    <w:p>
+      <w:pPr>
+        <w:spacing w:line="360" w:lineRule="auto"/>
+        <w:ind w:firstLine="709"/>
+        <w:jc w:val="both"/>
+        <w:rPr>
+          <w:rFonts w:ascii="Times New Roman" w:hAnsi="Times New Roman" w:cs="Times New Roman"/>
+          <w:b/>
+          <w:bCs/>
+          <w:sz w:val="28"/>
+          <w:szCs w:val="28"/>
+        </w:rPr>
+      </w:pPr>
+      <w:r>
+        <w:rPr>
+          <w:rFonts w:ascii="Times New Roman" w:hAnsi="Times New Roman" w:cs="Times New Roman"/>
+          <w:b/>
+          <w:bCs/>
+          <w:sz w:val="28"/>
+          <w:szCs w:val="28"/>
+        </w:rPr>
+        <w:t># КОНСПЕКТ ГОСТ</w:t>
+      </w:r>
+      <w:r>
+        <w:rPr>
+          <w:rFonts w:ascii="Times New Roman" w:hAnsi="Times New Roman" w:cs="Times New Roman"/>
+          <w:b/>
+          <w:bCs/>
+          <w:sz w:val="28"/>
+          <w:szCs w:val="28"/>
+        </w:rPr>
+        <w:t>ов</w:t>
+      </w:r>
+    </w:p>
+    <w:p>
+      <w:pPr>
+        <w:spacing w:line="360" w:lineRule="auto"/>
+        <w:ind w:firstLine="709"/>
+        <w:jc w:val="both"/>
+        <w:rPr>
+          <w:rFonts w:ascii="Times New Roman" w:hAnsi="Times New Roman" w:cs="Times New Roman"/>
+          <w:b/>
+          <w:bCs/>
+          <w:sz w:val="28"/>
+          <w:szCs w:val="28"/>
+        </w:rPr>
+      </w:pPr>
+    </w:p>
+    <w:p>
+      <w:pPr>
+        <w:spacing w:line="360" w:lineRule="auto"/>
+        <w:ind w:firstLine="709"/>
+        <w:jc w:val="both"/>
+        <w:rPr>
+          <w:rFonts w:ascii="Times New Roman" w:hAnsi="Times New Roman" w:cs="Times New Roman"/>
+          <w:b/>
+          <w:bCs/>
+          <w:sz w:val="28"/>
+          <w:szCs w:val="28"/>
+        </w:rPr>
+      </w:pPr>
+      <w:r>
+        <w:rPr>
+          <w:rFonts w:ascii="Times New Roman" w:hAnsi="Times New Roman" w:cs="Times New Roman"/>
+          <w:b/>
+          <w:bCs/>
+          <w:sz w:val="28"/>
+          <w:szCs w:val="28"/>
+        </w:rPr>
+        <w:t>## ГОСТ 19.201-78</w:t>
+      </w:r>
+    </w:p>
+    <w:p>
+      <w:pPr>
+        <w:spacing w:line="360" w:lineRule="auto"/>
+        <w:ind w:firstLine="709"/>
+        <w:jc w:val="both"/>
+        <w:rPr>
+          <w:rFonts w:ascii="Times New Roman" w:hAnsi="Times New Roman" w:cs="Times New Roman"/>
+          <w:sz w:val="28"/>
+          <w:szCs w:val="28"/>
+        </w:rPr>
+      </w:pPr>
+    </w:p>
+    <w:p>
+      <w:pPr>
+        <w:spacing w:line="360" w:lineRule="auto"/>
+        <w:ind w:firstLine="709"/>
+        <w:jc w:val="both"/>
+        <w:rPr>
+          <w:rFonts w:ascii="Times New Roman" w:hAnsi="Times New Roman" w:cs="Times New Roman"/>
+          <w:sz w:val="28"/>
+          <w:szCs w:val="28"/>
+        </w:rPr>
+      </w:pPr>
+      <w:r>
+        <w:rPr>
+          <w:rFonts w:ascii="Times New Roman" w:hAnsi="Times New Roman" w:cs="Times New Roman"/>
+          <w:sz w:val="28"/>
+          <w:szCs w:val="28"/>
+        </w:rPr>
+        <w:t>Определяет структуру и содержание технического задания на разработку программы.</w:t>
+      </w:r>
+    </w:p>
+    <w:p>
+      <w:pPr>
+        <w:spacing w:line="360" w:lineRule="auto"/>
+        <w:ind w:firstLine="709"/>
+        <w:jc w:val="both"/>
+        <w:rPr>
+          <w:rFonts w:ascii="Times New Roman" w:hAnsi="Times New Roman" w:cs="Times New Roman"/>
+          <w:sz w:val="28"/>
+          <w:szCs w:val="28"/>
+        </w:rPr>
+      </w:pPr>
+    </w:p>
+    <w:p>
+      <w:pPr>
+        <w:spacing w:line="360" w:lineRule="auto"/>
+        <w:ind w:firstLine="709"/>
+        <w:jc w:val="both"/>
+        <w:rPr>
+          <w:rFonts w:ascii="Times New Roman" w:hAnsi="Times New Roman" w:cs="Times New Roman"/>
+          <w:sz w:val="28"/>
+          <w:szCs w:val="28"/>
+        </w:rPr>
+      </w:pPr>
+    </w:p>
+    <w:p>
+      <w:pPr>
+        <w:spacing w:line="360" w:lineRule="auto"/>
+        <w:ind w:firstLine="709"/>
+        <w:jc w:val="both"/>
+        <w:rPr>
+          <w:rFonts w:ascii="Times New Roman" w:hAnsi="Times New Roman" w:cs="Times New Roman"/>
+          <w:sz w:val="28"/>
+          <w:szCs w:val="28"/>
+        </w:rPr>
+      </w:pPr>
+    </w:p>
+    <w:p>
+      <w:pPr>
+        <w:spacing w:line="360" w:lineRule="auto"/>
+        <w:ind w:firstLine="709"/>
+        <w:jc w:val="both"/>
+        <w:rPr>
+          <w:rFonts w:ascii="Times New Roman" w:hAnsi="Times New Roman" w:cs="Times New Roman"/>
+          <w:sz w:val="28"/>
+          <w:szCs w:val="28"/>
+        </w:rPr>
+      </w:pPr>
+    </w:p>
+    <w:p>
+      <w:pPr>
+        <w:spacing w:line="360" w:lineRule="auto"/>
+        <w:ind w:firstLine="709"/>
+        <w:jc w:val="both"/>
+        <w:rPr>
+          <w:rFonts w:ascii="Times New Roman" w:hAnsi="Times New Roman" w:cs="Times New Roman"/>
+          <w:sz w:val="28"/>
+          <w:szCs w:val="28"/>
+        </w:rPr>
+      </w:pPr>
+    </w:p>
+    <w:p>
+      <w:pPr>
+        <w:spacing w:line="360" w:lineRule="auto"/>
+        <w:ind w:firstLine="709"/>
+        <w:jc w:val="both"/>
+        <w:rPr>
+          <w:rFonts w:ascii="Times New Roman" w:hAnsi="Times New Roman" w:cs="Times New Roman"/>
+          <w:sz w:val="28"/>
+          <w:szCs w:val="28"/>
+        </w:rPr>
+      </w:pPr>
+      <w:r>
+        <w:rPr>
+          <w:rFonts w:ascii="Times New Roman" w:hAnsi="Times New Roman" w:cs="Times New Roman"/>
+          <w:sz w:val="28"/>
+          <w:szCs w:val="28"/>
+        </w:rPr>
+        <w:t>Основные разделы:</w:t>
+      </w:r>
+    </w:p>
+    <w:p>
+      <w:pPr>
+        <w:spacing w:line="360" w:lineRule="auto"/>
+        <w:ind w:firstLine="709"/>
+        <w:jc w:val="both"/>
+        <w:rPr>
+          <w:rFonts w:ascii="Times New Roman" w:hAnsi="Times New Roman" w:cs="Times New Roman"/>
+          <w:sz w:val="28"/>
+          <w:szCs w:val="28"/>
+        </w:rPr>
+      </w:pPr>
+      <w:r>
+        <w:rPr>
+          <w:rFonts w:ascii="Times New Roman" w:hAnsi="Times New Roman" w:cs="Times New Roman"/>
+          <w:sz w:val="28"/>
+          <w:szCs w:val="28"/>
+        </w:rPr>
+        <w:t>1. Введение.</w:t>
+      </w:r>
+    </w:p>
+    <w:p>
+      <w:pPr>
+        <w:spacing w:line="360" w:lineRule="auto"/>
+        <w:ind w:firstLine="709"/>
+        <w:jc w:val="both"/>
+        <w:rPr>
+          <w:rFonts w:ascii="Times New Roman" w:hAnsi="Times New Roman" w:cs="Times New Roman"/>
+          <w:sz w:val="28"/>
+          <w:szCs w:val="28"/>
+        </w:rPr>
+      </w:pPr>
+      <w:r>
+        <w:rPr>
+          <w:rFonts w:ascii="Times New Roman" w:hAnsi="Times New Roman" w:cs="Times New Roman"/>
+          <w:sz w:val="28"/>
+          <w:szCs w:val="28"/>
+        </w:rPr>
+        <w:t>2. Основания для разработки.</w:t>
+      </w:r>
+    </w:p>
+    <w:p>
+      <w:pPr>
+        <w:spacing w:line="360" w:lineRule="auto"/>
+        <w:ind w:firstLine="709"/>
+        <w:jc w:val="both"/>
+        <w:rPr>
+          <w:rFonts w:ascii="Times New Roman" w:hAnsi="Times New Roman" w:cs="Times New Roman"/>
+          <w:sz w:val="28"/>
+          <w:szCs w:val="28"/>
+        </w:rPr>
+      </w:pPr>
+      <w:r>
+        <w:rPr>
+          <w:rFonts w:ascii="Times New Roman" w:hAnsi="Times New Roman" w:cs="Times New Roman"/>
+          <w:sz w:val="28"/>
+          <w:szCs w:val="28"/>
+        </w:rPr>
+        <w:t>3. Назначение разработки.</w:t>
+      </w:r>
+    </w:p>
+    <w:p>
+      <w:pPr>
+        <w:spacing w:line="360" w:lineRule="auto"/>
+        <w:ind w:firstLine="709"/>
+        <w:jc w:val="both"/>
+        <w:rPr>
+          <w:rFonts w:ascii="Times New Roman" w:hAnsi="Times New Roman" w:cs="Times New Roman"/>
+          <w:sz w:val="28"/>
+          <w:szCs w:val="28"/>
+        </w:rPr>
+      </w:pPr>
+      <w:r>
+        <w:rPr>
+          <w:rFonts w:ascii="Times New Roman" w:hAnsi="Times New Roman" w:cs="Times New Roman"/>
+          <w:sz w:val="28"/>
+          <w:szCs w:val="28"/>
+        </w:rPr>
+        <w:t>4. Требования к программе.</w:t>
+      </w:r>
+    </w:p>
+    <w:p>
+      <w:pPr>
+        <w:spacing w:line="360" w:lineRule="auto"/>
+        <w:ind w:firstLine="709"/>
+        <w:jc w:val="both"/>
+        <w:rPr>
+          <w:rFonts w:ascii="Times New Roman" w:hAnsi="Times New Roman" w:cs="Times New Roman"/>
+          <w:sz w:val="28"/>
+          <w:szCs w:val="28"/>
+        </w:rPr>
+      </w:pPr>
+      <w:r>
+        <w:rPr>
+          <w:rFonts w:ascii="Times New Roman" w:hAnsi="Times New Roman" w:cs="Times New Roman"/>
+          <w:sz w:val="28"/>
+          <w:szCs w:val="28"/>
+        </w:rPr>
+        <w:t>5. Требования к программной документации.</w:t>
+      </w:r>
+    </w:p>
+    <w:p>
+      <w:pPr>
+        <w:spacing w:line="360" w:lineRule="auto"/>
+        <w:ind w:firstLine="709"/>
+        <w:jc w:val="both"/>
+        <w:rPr>
+          <w:rFonts w:ascii="Times New Roman" w:hAnsi="Times New Roman" w:cs="Times New Roman"/>
+          <w:sz w:val="28"/>
+          <w:szCs w:val="28"/>
+        </w:rPr>
+      </w:pPr>
+      <w:r>
+        <w:rPr>
+          <w:rFonts w:ascii="Times New Roman" w:hAnsi="Times New Roman" w:cs="Times New Roman"/>
+          <w:sz w:val="28"/>
+          <w:szCs w:val="28"/>
+        </w:rPr>
+        <w:t>6. Технико-экономические показатели.</w:t>
+      </w:r>
+    </w:p>
+    <w:p>
+      <w:pPr>
+        <w:spacing w:line="360" w:lineRule="auto"/>
+        <w:ind w:firstLine="709"/>
+        <w:jc w:val="both"/>
+        <w:rPr>
+          <w:rFonts w:ascii="Times New Roman" w:hAnsi="Times New Roman" w:cs="Times New Roman"/>
+          <w:sz w:val="28"/>
+          <w:szCs w:val="28"/>
+        </w:rPr>
+      </w:pPr>
+      <w:r>
+        <w:rPr>
+          <w:rFonts w:ascii="Times New Roman" w:hAnsi="Times New Roman" w:cs="Times New Roman"/>
+          <w:sz w:val="28"/>
+          <w:szCs w:val="28"/>
+        </w:rPr>
+        <w:t>7. Стадии и этапы разработки.</w:t>
+      </w:r>
+    </w:p>
+    <w:p>
+      <w:pPr>
+        <w:spacing w:line="360" w:lineRule="auto"/>
+        <w:ind w:firstLine="709"/>
+        <w:jc w:val="both"/>
+        <w:rPr>
+          <w:rFonts w:ascii="Times New Roman" w:hAnsi="Times New Roman" w:cs="Times New Roman"/>
+          <w:sz w:val="28"/>
+          <w:szCs w:val="28"/>
+        </w:rPr>
+      </w:pPr>
+      <w:r>
+        <w:rPr>
+          <w:rFonts w:ascii="Times New Roman" w:hAnsi="Times New Roman" w:cs="Times New Roman"/>
+          <w:sz w:val="28"/>
+          <w:szCs w:val="28"/>
+        </w:rPr>
+        <w:t>8. Порядок контроля и приемки.</w:t>
+      </w:r>
+    </w:p>
+    <w:p>
+      <w:pPr>
+        <w:spacing w:line="360" w:lineRule="auto"/>
+        <w:ind w:firstLine="709"/>
+        <w:jc w:val="both"/>
+        <w:rPr>
+          <w:rFonts w:ascii="Times New Roman" w:hAnsi="Times New Roman" w:cs="Times New Roman"/>
+          <w:sz w:val="28"/>
+          <w:szCs w:val="28"/>
+        </w:rPr>
+      </w:pPr>
+    </w:p>
+    <w:p>
+      <w:pPr>
+        <w:spacing w:line="360" w:lineRule="auto"/>
+        <w:ind w:firstLine="709"/>
+        <w:jc w:val="both"/>
+        <w:rPr>
+          <w:rFonts w:ascii="Times New Roman" w:hAnsi="Times New Roman" w:cs="Times New Roman"/>
+          <w:b/>
+          <w:bCs/>
+          <w:sz w:val="28"/>
+          <w:szCs w:val="28"/>
+        </w:rPr>
+      </w:pPr>
+      <w:r>
+        <w:rPr>
+          <w:rFonts w:ascii="Times New Roman" w:hAnsi="Times New Roman" w:cs="Times New Roman"/>
+          <w:b/>
+          <w:bCs/>
+          <w:sz w:val="28"/>
+          <w:szCs w:val="28"/>
+        </w:rPr>
+        <w:t>## ГОСТ 2.105-95</w:t>
+      </w:r>
+    </w:p>
+    <w:p>
+      <w:pPr>
+        <w:spacing w:line="360" w:lineRule="auto"/>
+        <w:ind w:firstLine="709"/>
+        <w:jc w:val="both"/>
+        <w:rPr>
+          <w:rFonts w:ascii="Times New Roman" w:hAnsi="Times New Roman" w:cs="Times New Roman"/>
+          <w:sz w:val="28"/>
+          <w:szCs w:val="28"/>
+        </w:rPr>
+      </w:pPr>
+    </w:p>
+    <w:p>
+      <w:pPr>
+        <w:spacing w:line="360" w:lineRule="auto"/>
+        <w:ind w:firstLine="709"/>
+        <w:jc w:val="both"/>
+        <w:rPr>
+          <w:rFonts w:ascii="Times New Roman" w:hAnsi="Times New Roman" w:cs="Times New Roman"/>
+          <w:sz w:val="28"/>
+          <w:szCs w:val="28"/>
+        </w:rPr>
+      </w:pPr>
+      <w:r>
+        <w:rPr>
+          <w:rFonts w:ascii="Times New Roman" w:hAnsi="Times New Roman" w:cs="Times New Roman"/>
+          <w:sz w:val="28"/>
+          <w:szCs w:val="28"/>
+        </w:rPr>
+        <w:t>Устанавливает правила оформления текстовых документов.</w:t>
+      </w:r>
+    </w:p>
+    <w:p>
+      <w:pPr>
+        <w:spacing w:line="360" w:lineRule="auto"/>
+        <w:ind w:firstLine="709"/>
+        <w:jc w:val="both"/>
+        <w:rPr>
+          <w:rFonts w:ascii="Times New Roman" w:hAnsi="Times New Roman" w:cs="Times New Roman"/>
+          <w:sz w:val="28"/>
+          <w:szCs w:val="28"/>
+        </w:rPr>
+      </w:pPr>
+    </w:p>
+    <w:p>
+      <w:pPr>
+        <w:spacing w:line="360" w:lineRule="auto"/>
+        <w:ind w:firstLine="709"/>
+        <w:jc w:val="both"/>
+        <w:rPr>
+          <w:rFonts w:ascii="Times New Roman" w:hAnsi="Times New Roman" w:cs="Times New Roman"/>
+          <w:sz w:val="28"/>
+          <w:szCs w:val="28"/>
+        </w:rPr>
+      </w:pPr>
+      <w:r>
+        <w:rPr>
+          <w:rFonts w:ascii="Times New Roman" w:hAnsi="Times New Roman" w:cs="Times New Roman"/>
+          <w:sz w:val="28"/>
+          <w:szCs w:val="28"/>
+        </w:rPr>
+        <w:t>Требования:</w:t>
+      </w:r>
+    </w:p>
+    <w:p>
+      <w:pPr>
+        <w:spacing w:line="360" w:lineRule="auto"/>
+        <w:ind w:firstLine="709"/>
+        <w:jc w:val="both"/>
+        <w:rPr>
+          <w:rFonts w:ascii="Times New Roman" w:hAnsi="Times New Roman" w:cs="Times New Roman"/>
+          <w:sz w:val="28"/>
+          <w:szCs w:val="28"/>
+        </w:rPr>
+      </w:pPr>
+      <w:r>
+        <w:rPr>
+          <w:rFonts w:ascii="Times New Roman" w:hAnsi="Times New Roman" w:cs="Times New Roman"/>
+          <w:sz w:val="28"/>
+          <w:szCs w:val="28"/>
+        </w:rPr>
+        <w:t>- Формат А4.</w:t>
+      </w:r>
+    </w:p>
+    <w:p>
+      <w:pPr>
+        <w:spacing w:line="360" w:lineRule="auto"/>
+        <w:ind w:firstLine="709"/>
+        <w:jc w:val="both"/>
+        <w:rPr>
+          <w:rFonts w:ascii="Times New Roman" w:hAnsi="Times New Roman" w:cs="Times New Roman"/>
+          <w:sz w:val="28"/>
+          <w:szCs w:val="28"/>
+        </w:rPr>
+      </w:pPr>
+      <w:r>
+        <w:rPr>
+          <w:rFonts w:ascii="Times New Roman" w:hAnsi="Times New Roman" w:cs="Times New Roman"/>
+          <w:sz w:val="28"/>
+          <w:szCs w:val="28"/>
+        </w:rPr>
+        <w:t>- Шрифт Times New Roman.</w:t>
+      </w:r>
+    </w:p>
+    <w:p>
+      <w:pPr>
+        <w:spacing w:line="360" w:lineRule="auto"/>
+        <w:ind w:firstLine="709"/>
+        <w:jc w:val="both"/>
+        <w:rPr>
+          <w:rFonts w:ascii="Times New Roman" w:hAnsi="Times New Roman" w:cs="Times New Roman"/>
+          <w:sz w:val="28"/>
+          <w:szCs w:val="28"/>
+        </w:rPr>
+      </w:pPr>
+      <w:r>
+        <w:rPr>
+          <w:rFonts w:ascii="Times New Roman" w:hAnsi="Times New Roman" w:cs="Times New Roman"/>
+          <w:sz w:val="28"/>
+          <w:szCs w:val="28"/>
+        </w:rPr>
+        <w:t>- Размер шрифта 14 пт.</w:t>
+      </w:r>
+    </w:p>
+    <w:p>
+      <w:pPr>
+        <w:spacing w:line="360" w:lineRule="auto"/>
+        <w:ind w:firstLine="709"/>
+        <w:jc w:val="both"/>
+        <w:rPr>
+          <w:rFonts w:ascii="Times New Roman" w:hAnsi="Times New Roman" w:cs="Times New Roman"/>
+          <w:sz w:val="28"/>
+          <w:szCs w:val="28"/>
+        </w:rPr>
+      </w:pPr>
+      <w:r>
+        <w:rPr>
+          <w:rFonts w:ascii="Times New Roman" w:hAnsi="Times New Roman" w:cs="Times New Roman"/>
+          <w:sz w:val="28"/>
+          <w:szCs w:val="28"/>
+        </w:rPr>
+        <w:t>- Межстрочный интервал 1,5.</w:t>
+      </w:r>
+    </w:p>
+    <w:p>
+      <w:pPr>
+        <w:spacing w:line="360" w:lineRule="auto"/>
+        <w:ind w:firstLine="709"/>
+        <w:jc w:val="both"/>
         <w:rPr>
           <w:rFonts w:ascii="Times New Roman" w:hAnsi="Times New Roman" w:cs="Times New Roman"/>
           <w:sz w:val="28"/>
@@ -3440,434 +3963,6 @@
           <w:szCs w:val="28"/>
         </w:rPr>
         <w:lastRenderedPageBreak/>
-        <w:t># Конспект ГОСТов</w:t>
-      </w:r>
-    </w:p>
-    <w:p>
-      <w:pPr>
-        <w:spacing w:line="360" w:lineRule="auto"/>
-        <w:ind w:firstLine="709"/>
-        <w:rPr>
-          <w:rFonts w:ascii="Times New Roman" w:hAnsi="Times New Roman" w:cs="Times New Roman"/>
-          <w:sz w:val="28"/>
-          <w:szCs w:val="28"/>
-        </w:rPr>
-      </w:pPr>
-    </w:p>
-    <w:p>
-      <w:pPr>
-        <w:spacing w:line="360" w:lineRule="auto"/>
-        <w:ind w:firstLine="709"/>
-        <w:rPr>
-          <w:rFonts w:ascii="Times New Roman" w:hAnsi="Times New Roman" w:cs="Times New Roman"/>
-          <w:sz w:val="28"/>
-          <w:szCs w:val="28"/>
-        </w:rPr>
-      </w:pPr>
-      <w:r>
-        <w:rPr>
-          <w:rFonts w:ascii="Times New Roman" w:hAnsi="Times New Roman" w:cs="Times New Roman"/>
-          <w:sz w:val="28"/>
-          <w:szCs w:val="28"/>
-        </w:rPr>
-        <w:t>## ГОСТ 19.201-78</w:t>
-      </w:r>
-    </w:p>
-    <w:p>
-      <w:pPr>
-        <w:spacing w:line="360" w:lineRule="auto"/>
-        <w:ind w:firstLine="709"/>
-        <w:rPr>
-          <w:rFonts w:ascii="Times New Roman" w:hAnsi="Times New Roman" w:cs="Times New Roman"/>
-          <w:sz w:val="28"/>
-          <w:szCs w:val="28"/>
-        </w:rPr>
-      </w:pPr>
-    </w:p>
-    <w:p>
-      <w:pPr>
-        <w:spacing w:line="360" w:lineRule="auto"/>
-        <w:ind w:firstLine="709"/>
-        <w:rPr>
-          <w:rFonts w:ascii="Times New Roman" w:hAnsi="Times New Roman" w:cs="Times New Roman"/>
-          <w:sz w:val="28"/>
-          <w:szCs w:val="28"/>
-        </w:rPr>
-      </w:pPr>
-      <w:r>
-        <w:rPr>
-          <w:rFonts w:ascii="Times New Roman" w:hAnsi="Times New Roman" w:cs="Times New Roman"/>
-          <w:sz w:val="28"/>
-          <w:szCs w:val="28"/>
-        </w:rPr>
-        <w:t>Определяет структуру и содержание технического задания на разработку программы.</w:t>
-      </w:r>
-    </w:p>
-    <w:p>
-      <w:pPr>
-        <w:spacing w:line="360" w:lineRule="auto"/>
-        <w:ind w:firstLine="709"/>
-        <w:rPr>
-          <w:rFonts w:ascii="Times New Roman" w:hAnsi="Times New Roman" w:cs="Times New Roman"/>
-          <w:sz w:val="28"/>
-          <w:szCs w:val="28"/>
-        </w:rPr>
-      </w:pPr>
-    </w:p>
-    <w:p>
-      <w:pPr>
-        <w:spacing w:line="360" w:lineRule="auto"/>
-        <w:ind w:firstLine="709"/>
-        <w:rPr>
-          <w:rFonts w:ascii="Times New Roman" w:hAnsi="Times New Roman" w:cs="Times New Roman"/>
-          <w:sz w:val="28"/>
-          <w:szCs w:val="28"/>
-        </w:rPr>
-      </w:pPr>
-      <w:r>
-        <w:rPr>
-          <w:rFonts w:ascii="Times New Roman" w:hAnsi="Times New Roman" w:cs="Times New Roman"/>
-          <w:sz w:val="28"/>
-          <w:szCs w:val="28"/>
-        </w:rPr>
-        <w:t>Основные разделы:</w:t>
-      </w:r>
-    </w:p>
-    <w:p>
-      <w:pPr>
-        <w:spacing w:line="360" w:lineRule="auto"/>
-        <w:ind w:firstLine="709"/>
-        <w:rPr>
-          <w:rFonts w:ascii="Times New Roman" w:hAnsi="Times New Roman" w:cs="Times New Roman"/>
-          <w:sz w:val="28"/>
-          <w:szCs w:val="28"/>
-        </w:rPr>
-      </w:pPr>
-      <w:r>
-        <w:rPr>
-          <w:rFonts w:ascii="Times New Roman" w:hAnsi="Times New Roman" w:cs="Times New Roman"/>
-          <w:sz w:val="28"/>
-          <w:szCs w:val="28"/>
-        </w:rPr>
-        <w:t>1. Введение.</w:t>
-      </w:r>
-    </w:p>
-    <w:p>
-      <w:pPr>
-        <w:spacing w:line="360" w:lineRule="auto"/>
-        <w:ind w:firstLine="709"/>
-        <w:rPr>
-          <w:rFonts w:ascii="Times New Roman" w:hAnsi="Times New Roman" w:cs="Times New Roman"/>
-          <w:sz w:val="28"/>
-          <w:szCs w:val="28"/>
-        </w:rPr>
-      </w:pPr>
-      <w:r>
-        <w:rPr>
-          <w:rFonts w:ascii="Times New Roman" w:hAnsi="Times New Roman" w:cs="Times New Roman"/>
-          <w:sz w:val="28"/>
-          <w:szCs w:val="28"/>
-        </w:rPr>
-        <w:t>2. Основания для разработки.</w:t>
-      </w:r>
-    </w:p>
-    <w:p>
-      <w:pPr>
-        <w:spacing w:line="360" w:lineRule="auto"/>
-        <w:ind w:firstLine="709"/>
-        <w:rPr>
-          <w:rFonts w:ascii="Times New Roman" w:hAnsi="Times New Roman" w:cs="Times New Roman"/>
-          <w:sz w:val="28"/>
-          <w:szCs w:val="28"/>
-        </w:rPr>
-      </w:pPr>
-      <w:r>
-        <w:rPr>
-          <w:rFonts w:ascii="Times New Roman" w:hAnsi="Times New Roman" w:cs="Times New Roman"/>
-          <w:sz w:val="28"/>
-          <w:szCs w:val="28"/>
-        </w:rPr>
-        <w:t>3. Назначение разработки.</w:t>
-      </w:r>
-    </w:p>
-    <w:p>
-      <w:pPr>
-        <w:spacing w:line="360" w:lineRule="auto"/>
-        <w:ind w:firstLine="709"/>
-        <w:rPr>
-          <w:rFonts w:ascii="Times New Roman" w:hAnsi="Times New Roman" w:cs="Times New Roman"/>
-          <w:sz w:val="28"/>
-          <w:szCs w:val="28"/>
-        </w:rPr>
-      </w:pPr>
-      <w:r>
-        <w:rPr>
-          <w:rFonts w:ascii="Times New Roman" w:hAnsi="Times New Roman" w:cs="Times New Roman"/>
-          <w:sz w:val="28"/>
-          <w:szCs w:val="28"/>
-        </w:rPr>
-        <w:t>4. Требования к программе.</w:t>
-      </w:r>
-    </w:p>
-    <w:p>
-      <w:pPr>
-        <w:spacing w:line="360" w:lineRule="auto"/>
-        <w:ind w:firstLine="709"/>
-        <w:rPr>
-          <w:rFonts w:ascii="Times New Roman" w:hAnsi="Times New Roman" w:cs="Times New Roman"/>
-          <w:sz w:val="28"/>
-          <w:szCs w:val="28"/>
-        </w:rPr>
-      </w:pPr>
-      <w:r>
-        <w:rPr>
-          <w:rFonts w:ascii="Times New Roman" w:hAnsi="Times New Roman" w:cs="Times New Roman"/>
-          <w:sz w:val="28"/>
-          <w:szCs w:val="28"/>
-        </w:rPr>
-        <w:t>5. Требования к программной документации.</w:t>
-      </w:r>
-    </w:p>
-    <w:p>
-      <w:pPr>
-        <w:spacing w:line="360" w:lineRule="auto"/>
-        <w:ind w:firstLine="709"/>
-        <w:rPr>
-          <w:rFonts w:ascii="Times New Roman" w:hAnsi="Times New Roman" w:cs="Times New Roman"/>
-          <w:sz w:val="28"/>
-          <w:szCs w:val="28"/>
-        </w:rPr>
-      </w:pPr>
-      <w:r>
-        <w:rPr>
-          <w:rFonts w:ascii="Times New Roman" w:hAnsi="Times New Roman" w:cs="Times New Roman"/>
-          <w:sz w:val="28"/>
-          <w:szCs w:val="28"/>
-        </w:rPr>
-        <w:t>6. Технико-экономические показатели.</w:t>
-      </w:r>
-    </w:p>
-    <w:p>
-      <w:pPr>
-        <w:spacing w:line="360" w:lineRule="auto"/>
-        <w:ind w:firstLine="709"/>
-        <w:rPr>
-          <w:rFonts w:ascii="Times New Roman" w:hAnsi="Times New Roman" w:cs="Times New Roman"/>
-          <w:sz w:val="28"/>
-          <w:szCs w:val="28"/>
-        </w:rPr>
-      </w:pPr>
-      <w:r>
-        <w:rPr>
-          <w:rFonts w:ascii="Times New Roman" w:hAnsi="Times New Roman" w:cs="Times New Roman"/>
-          <w:sz w:val="28"/>
-          <w:szCs w:val="28"/>
-        </w:rPr>
-        <w:t>7. Стадии и этапы разработки.</w:t>
-      </w:r>
-    </w:p>
-    <w:p>
-      <w:pPr>
-        <w:spacing w:line="360" w:lineRule="auto"/>
-        <w:ind w:firstLine="709"/>
-        <w:rPr>
-          <w:rFonts w:ascii="Times New Roman" w:hAnsi="Times New Roman" w:cs="Times New Roman"/>
-          <w:sz w:val="28"/>
-          <w:szCs w:val="28"/>
-        </w:rPr>
-      </w:pPr>
-      <w:r>
-        <w:rPr>
-          <w:rFonts w:ascii="Times New Roman" w:hAnsi="Times New Roman" w:cs="Times New Roman"/>
-          <w:sz w:val="28"/>
-          <w:szCs w:val="28"/>
-        </w:rPr>
-        <w:t>8. Порядок контроля и приемки.</w:t>
-      </w:r>
-    </w:p>
-    <w:p>
-      <w:pPr>
-        <w:spacing w:line="360" w:lineRule="auto"/>
-        <w:ind w:firstLine="709"/>
-        <w:rPr>
-          <w:rFonts w:ascii="Times New Roman" w:hAnsi="Times New Roman" w:cs="Times New Roman"/>
-          <w:sz w:val="28"/>
-          <w:szCs w:val="28"/>
-        </w:rPr>
-      </w:pPr>
-    </w:p>
-    <w:p>
-      <w:pPr>
-        <w:spacing w:line="360" w:lineRule="auto"/>
-        <w:ind w:firstLine="709"/>
-        <w:rPr>
-          <w:rFonts w:ascii="Times New Roman" w:hAnsi="Times New Roman" w:cs="Times New Roman"/>
-          <w:sz w:val="28"/>
-          <w:szCs w:val="28"/>
-        </w:rPr>
-      </w:pPr>
-      <w:r>
-        <w:rPr>
-          <w:rFonts w:ascii="Times New Roman" w:hAnsi="Times New Roman" w:cs="Times New Roman"/>
-          <w:sz w:val="28"/>
-          <w:szCs w:val="28"/>
-        </w:rPr>
-        <w:t>## ГОСТ 2.105-95</w:t>
-      </w:r>
-    </w:p>
-    <w:p>
-      <w:pPr>
-        <w:spacing w:line="360" w:lineRule="auto"/>
-        <w:ind w:firstLine="709"/>
-        <w:rPr>
-          <w:rFonts w:ascii="Times New Roman" w:hAnsi="Times New Roman" w:cs="Times New Roman"/>
-          <w:sz w:val="28"/>
-          <w:szCs w:val="28"/>
-        </w:rPr>
-      </w:pPr>
-    </w:p>
-    <w:p>
-      <w:pPr>
-        <w:spacing w:line="360" w:lineRule="auto"/>
-        <w:ind w:firstLine="709"/>
-        <w:rPr>
-          <w:rFonts w:ascii="Times New Roman" w:hAnsi="Times New Roman" w:cs="Times New Roman"/>
-          <w:sz w:val="28"/>
-          <w:szCs w:val="28"/>
-        </w:rPr>
-      </w:pPr>
-      <w:r>
-        <w:rPr>
-          <w:rFonts w:ascii="Times New Roman" w:hAnsi="Times New Roman" w:cs="Times New Roman"/>
-          <w:sz w:val="28"/>
-          <w:szCs w:val="28"/>
-        </w:rPr>
-        <w:t>Устанавливает правила оформления текстовых документов.</w:t>
-      </w:r>
-    </w:p>
-    <w:p>
-      <w:pPr>
-        <w:spacing w:line="360" w:lineRule="auto"/>
-        <w:ind w:firstLine="709"/>
-        <w:rPr>
-          <w:rFonts w:ascii="Times New Roman" w:hAnsi="Times New Roman" w:cs="Times New Roman"/>
-          <w:sz w:val="28"/>
-          <w:szCs w:val="28"/>
-        </w:rPr>
-      </w:pPr>
-    </w:p>
-    <w:p>
-      <w:pPr>
-        <w:spacing w:line="360" w:lineRule="auto"/>
-        <w:ind w:firstLine="709"/>
-        <w:rPr>
-          <w:rFonts w:ascii="Times New Roman" w:hAnsi="Times New Roman" w:cs="Times New Roman"/>
-          <w:sz w:val="28"/>
-          <w:szCs w:val="28"/>
-        </w:rPr>
-      </w:pPr>
-      <w:r>
-        <w:rPr>
-          <w:rFonts w:ascii="Times New Roman" w:hAnsi="Times New Roman" w:cs="Times New Roman"/>
-          <w:sz w:val="28"/>
-          <w:szCs w:val="28"/>
-        </w:rPr>
-        <w:t>Требования:</w:t>
-      </w:r>
-    </w:p>
-    <w:p>
-      <w:pPr>
-        <w:spacing w:line="360" w:lineRule="auto"/>
-        <w:ind w:firstLine="709"/>
-        <w:rPr>
-          <w:rFonts w:ascii="Times New Roman" w:hAnsi="Times New Roman" w:cs="Times New Roman"/>
-          <w:sz w:val="28"/>
-          <w:szCs w:val="28"/>
-        </w:rPr>
-      </w:pPr>
-      <w:r>
-        <w:rPr>
-          <w:rFonts w:ascii="Times New Roman" w:hAnsi="Times New Roman" w:cs="Times New Roman"/>
-          <w:sz w:val="28"/>
-          <w:szCs w:val="28"/>
-        </w:rPr>
-        <w:t>- Формат А4.</w:t>
-      </w:r>
-    </w:p>
-    <w:p>
-      <w:pPr>
-        <w:spacing w:line="360" w:lineRule="auto"/>
-        <w:ind w:firstLine="709"/>
-        <w:rPr>
-          <w:rFonts w:ascii="Times New Roman" w:hAnsi="Times New Roman" w:cs="Times New Roman"/>
-          <w:sz w:val="28"/>
-          <w:szCs w:val="28"/>
-        </w:rPr>
-      </w:pPr>
-      <w:r>
-        <w:rPr>
-          <w:rFonts w:ascii="Times New Roman" w:hAnsi="Times New Roman" w:cs="Times New Roman"/>
-          <w:sz w:val="28"/>
-          <w:szCs w:val="28"/>
-        </w:rPr>
-        <w:lastRenderedPageBreak/>
-        <w:t>- Шрифт Times New Roman.</w:t>
-      </w:r>
-    </w:p>
-    <w:p>
-      <w:pPr>
-        <w:spacing w:line="360" w:lineRule="auto"/>
-        <w:ind w:firstLine="709"/>
-        <w:rPr>
-          <w:rFonts w:ascii="Times New Roman" w:hAnsi="Times New Roman" w:cs="Times New Roman"/>
-          <w:sz w:val="28"/>
-          <w:szCs w:val="28"/>
-        </w:rPr>
-      </w:pPr>
-      <w:r>
-        <w:rPr>
-          <w:rFonts w:ascii="Times New Roman" w:hAnsi="Times New Roman" w:cs="Times New Roman"/>
-          <w:sz w:val="28"/>
-          <w:szCs w:val="28"/>
-        </w:rPr>
-        <w:t>- Размер шрифта 14 пт.</w:t>
-      </w:r>
-    </w:p>
-    <w:p>
-      <w:pPr>
-        <w:spacing w:line="360" w:lineRule="auto"/>
-        <w:ind w:firstLine="709"/>
-        <w:rPr>
-          <w:rFonts w:ascii="Times New Roman" w:hAnsi="Times New Roman" w:cs="Times New Roman"/>
-          <w:sz w:val="28"/>
-          <w:szCs w:val="28"/>
-        </w:rPr>
-      </w:pPr>
-      <w:r>
-        <w:rPr>
-          <w:rFonts w:ascii="Times New Roman" w:hAnsi="Times New Roman" w:cs="Times New Roman"/>
-          <w:sz w:val="28"/>
-          <w:szCs w:val="28"/>
-        </w:rPr>
-        <w:t>- Межстрочный интервал 1,5.</w:t>
-      </w:r>
-    </w:p>
-    <w:p>
-      <w:pPr>
-        <w:spacing w:line="360" w:lineRule="auto"/>
-        <w:ind w:firstLine="709"/>
-        <w:rPr>
-          <w:rFonts w:ascii="Times New Roman" w:hAnsi="Times New Roman" w:cs="Times New Roman"/>
-          <w:sz w:val="28"/>
-          <w:szCs w:val="28"/>
-        </w:rPr>
-      </w:pPr>
-      <w:r>
-        <w:rPr>
-          <w:rFonts w:ascii="Times New Roman" w:hAnsi="Times New Roman" w:cs="Times New Roman"/>
-          <w:sz w:val="28"/>
-          <w:szCs w:val="28"/>
-        </w:rPr>
         <w:t>- Левое поле 30 мм.</w:t>
       </w:r>
     </w:p>
@@ -3875,6 +3970,7 @@
       <w:pPr>
         <w:spacing w:line="360" w:lineRule="auto"/>
         <w:ind w:firstLine="709"/>
+        <w:jc w:val="both"/>
         <w:rPr>
           <w:rFonts w:ascii="Times New Roman" w:hAnsi="Times New Roman" w:cs="Times New Roman"/>
           <w:sz w:val="28"/>
@@ -3894,6 +3990,7 @@
       <w:pPr>
         <w:spacing w:line="360" w:lineRule="auto"/>
         <w:ind w:firstLine="709"/>
+        <w:jc w:val="both"/>
         <w:rPr>
           <w:rFonts w:ascii="Times New Roman" w:hAnsi="Times New Roman" w:cs="Times New Roman"/>
           <w:sz w:val="28"/>
@@ -3913,6 +4010,7 @@
       <w:pPr>
         <w:spacing w:line="360" w:lineRule="auto"/>
         <w:ind w:firstLine="709"/>
+        <w:jc w:val="both"/>
         <w:rPr>
           <w:rFonts w:ascii="Times New Roman" w:hAnsi="Times New Roman" w:cs="Times New Roman"/>
           <w:sz w:val="28"/>
@@ -3932,6 +4030,7 @@
       <w:pPr>
         <w:spacing w:line="360" w:lineRule="auto"/>
         <w:ind w:firstLine="709"/>
+        <w:jc w:val="both"/>
         <w:rPr>
           <w:rFonts w:ascii="Times New Roman" w:hAnsi="Times New Roman" w:cs="Times New Roman"/>
           <w:sz w:val="28"/>
@@ -3951,6 +4050,7 @@
       <w:pPr>
         <w:spacing w:line="360" w:lineRule="auto"/>
         <w:ind w:firstLine="709"/>
+        <w:jc w:val="both"/>
         <w:rPr>
           <w:rFonts w:ascii="Times New Roman" w:hAnsi="Times New Roman" w:cs="Times New Roman"/>
           <w:sz w:val="28"/>
@@ -3970,26 +4070,32 @@
       <w:pPr>
         <w:spacing w:line="360" w:lineRule="auto"/>
         <w:ind w:firstLine="709"/>
-        <w:rPr>
-          <w:rFonts w:ascii="Times New Roman" w:hAnsi="Times New Roman" w:cs="Times New Roman"/>
-          <w:sz w:val="28"/>
-          <w:szCs w:val="28"/>
-        </w:rPr>
-      </w:pPr>
-    </w:p>
-    <w:p>
-      <w:pPr>
-        <w:spacing w:line="360" w:lineRule="auto"/>
-        <w:ind w:firstLine="709"/>
-        <w:rPr>
-          <w:rFonts w:ascii="Times New Roman" w:hAnsi="Times New Roman" w:cs="Times New Roman"/>
-          <w:sz w:val="28"/>
-          <w:szCs w:val="28"/>
-        </w:rPr>
-      </w:pPr>
-      <w:r>
-        <w:rPr>
-          <w:rFonts w:ascii="Times New Roman" w:hAnsi="Times New Roman" w:cs="Times New Roman"/>
+        <w:jc w:val="both"/>
+        <w:rPr>
+          <w:rFonts w:ascii="Times New Roman" w:hAnsi="Times New Roman" w:cs="Times New Roman"/>
+          <w:sz w:val="28"/>
+          <w:szCs w:val="28"/>
+        </w:rPr>
+      </w:pPr>
+    </w:p>
+    <w:p>
+      <w:pPr>
+        <w:spacing w:line="360" w:lineRule="auto"/>
+        <w:ind w:firstLine="709"/>
+        <w:jc w:val="both"/>
+        <w:rPr>
+          <w:rFonts w:ascii="Times New Roman" w:hAnsi="Times New Roman" w:cs="Times New Roman"/>
+          <w:b/>
+          <w:bCs/>
+          <w:sz w:val="28"/>
+          <w:szCs w:val="28"/>
+        </w:rPr>
+      </w:pPr>
+      <w:r>
+        <w:rPr>
+          <w:rFonts w:ascii="Times New Roman" w:hAnsi="Times New Roman" w:cs="Times New Roman"/>
+          <w:b/>
+          <w:bCs/>
           <w:sz w:val="28"/>
           <w:szCs w:val="28"/>
         </w:rPr>
@@ -4000,17 +4106,19 @@
       <w:pPr>
         <w:spacing w:line="360" w:lineRule="auto"/>
         <w:ind w:firstLine="709"/>
-        <w:rPr>
-          <w:rFonts w:ascii="Times New Roman" w:hAnsi="Times New Roman" w:cs="Times New Roman"/>
-          <w:sz w:val="28"/>
-          <w:szCs w:val="28"/>
-        </w:rPr>
-      </w:pPr>
-    </w:p>
-    <w:p>
-      <w:pPr>
-        <w:spacing w:line="360" w:lineRule="auto"/>
-        <w:ind w:firstLine="709"/>
+        <w:jc w:val="both"/>
+        <w:rPr>
+          <w:rFonts w:ascii="Times New Roman" w:hAnsi="Times New Roman" w:cs="Times New Roman"/>
+          <w:sz w:val="28"/>
+          <w:szCs w:val="28"/>
+        </w:rPr>
+      </w:pPr>
+    </w:p>
+    <w:p>
+      <w:pPr>
+        <w:spacing w:line="360" w:lineRule="auto"/>
+        <w:ind w:firstLine="709"/>
+        <w:jc w:val="both"/>
         <w:rPr>
           <w:rFonts w:ascii="Times New Roman" w:hAnsi="Times New Roman" w:cs="Times New Roman"/>
           <w:sz w:val="28"/>
@@ -4030,17 +4138,19 @@
       <w:pPr>
         <w:spacing w:line="360" w:lineRule="auto"/>
         <w:ind w:firstLine="709"/>
-        <w:rPr>
-          <w:rFonts w:ascii="Times New Roman" w:hAnsi="Times New Roman" w:cs="Times New Roman"/>
-          <w:sz w:val="28"/>
-          <w:szCs w:val="28"/>
-        </w:rPr>
-      </w:pPr>
-    </w:p>
-    <w:p>
-      <w:pPr>
-        <w:spacing w:line="360" w:lineRule="auto"/>
-        <w:ind w:firstLine="709"/>
+        <w:jc w:val="both"/>
+        <w:rPr>
+          <w:rFonts w:ascii="Times New Roman" w:hAnsi="Times New Roman" w:cs="Times New Roman"/>
+          <w:sz w:val="28"/>
+          <w:szCs w:val="28"/>
+        </w:rPr>
+      </w:pPr>
+    </w:p>
+    <w:p>
+      <w:pPr>
+        <w:spacing w:line="360" w:lineRule="auto"/>
+        <w:ind w:firstLine="709"/>
+        <w:jc w:val="both"/>
         <w:rPr>
           <w:rFonts w:ascii="Times New Roman" w:hAnsi="Times New Roman" w:cs="Times New Roman"/>
           <w:sz w:val="28"/>
@@ -4060,6 +4170,7 @@
       <w:pPr>
         <w:spacing w:line="360" w:lineRule="auto"/>
         <w:ind w:firstLine="709"/>
+        <w:jc w:val="both"/>
         <w:rPr>
           <w:rFonts w:ascii="Times New Roman" w:hAnsi="Times New Roman" w:cs="Times New Roman"/>
           <w:sz w:val="28"/>
@@ -4079,6 +4190,7 @@
       <w:pPr>
         <w:spacing w:line="360" w:lineRule="auto"/>
         <w:ind w:firstLine="709"/>
+        <w:jc w:val="both"/>
         <w:rPr>
           <w:rFonts w:ascii="Times New Roman" w:hAnsi="Times New Roman" w:cs="Times New Roman"/>
           <w:sz w:val="28"/>
@@ -4098,6 +4210,7 @@
       <w:pPr>
         <w:spacing w:line="360" w:lineRule="auto"/>
         <w:ind w:firstLine="709"/>
+        <w:jc w:val="both"/>
         <w:rPr>
           <w:rFonts w:ascii="Times New Roman" w:hAnsi="Times New Roman" w:cs="Times New Roman"/>
           <w:sz w:val="28"/>
@@ -4117,6 +4230,7 @@
       <w:pPr>
         <w:spacing w:line="360" w:lineRule="auto"/>
         <w:ind w:firstLine="709"/>
+        <w:jc w:val="both"/>
         <w:rPr>
           <w:rFonts w:ascii="Times New Roman" w:hAnsi="Times New Roman" w:cs="Times New Roman"/>
           <w:sz w:val="28"/>
@@ -4136,6 +4250,7 @@
       <w:pPr>
         <w:spacing w:line="360" w:lineRule="auto"/>
         <w:ind w:firstLine="709"/>
+        <w:jc w:val="both"/>
         <w:rPr>
           <w:rFonts w:ascii="Times New Roman" w:hAnsi="Times New Roman" w:cs="Times New Roman"/>
           <w:sz w:val="28"/>
@@ -4155,6 +4270,7 @@
       <w:pPr>
         <w:spacing w:line="360" w:lineRule="auto"/>
         <w:ind w:firstLine="709"/>
+        <w:jc w:val="both"/>
         <w:rPr>
           <w:rFonts w:ascii="Times New Roman" w:hAnsi="Times New Roman" w:cs="Times New Roman"/>
           <w:sz w:val="28"/>
@@ -4173,17 +4289,7 @@
     <w:p>
       <w:pPr>
         <w:spacing w:line="360" w:lineRule="auto"/>
-        <w:ind w:firstLine="709"/>
-        <w:rPr>
-          <w:rFonts w:ascii="Times New Roman" w:hAnsi="Times New Roman" w:cs="Times New Roman"/>
-          <w:sz w:val="28"/>
-          <w:szCs w:val="28"/>
-        </w:rPr>
-      </w:pPr>
-    </w:p>
-    <w:p>
-      <w:pPr>
-        <w:spacing w:line="360" w:lineRule="auto"/>
+        <w:jc w:val="center"/>
         <w:rPr>
           <w:rFonts w:ascii="Times New Roman" w:hAnsi="Times New Roman" w:cs="Times New Roman"/>
           <w:sz w:val="28"/>
@@ -4240,6 +4346,47 @@
           </wp:inline>
         </w:drawing>
       </w:r>
+    </w:p>
+    <w:p>
+      <w:pPr>
+        <w:spacing w:line="360" w:lineRule="auto"/>
+        <w:ind w:firstLine="709"/>
+        <w:jc w:val="center"/>
+        <w:rPr>
+          <w:rFonts w:ascii="Times New Roman" w:hAnsi="Times New Roman" w:cs="Times New Roman"/>
+          <w:sz w:val="28"/>
+          <w:szCs w:val="28"/>
+        </w:rPr>
+      </w:pPr>
+      <w:r>
+        <w:rPr>
+          <w:rFonts w:ascii="Times New Roman" w:hAnsi="Times New Roman" w:cs="Times New Roman"/>
+          <w:sz w:val="28"/>
+          <w:szCs w:val="28"/>
+        </w:rPr>
+        <w:t>Рисунок 1. Страница входа</w:t>
+      </w:r>
+    </w:p>
+    <w:p>
+      <w:pPr>
+        <w:spacing w:line="360" w:lineRule="auto"/>
+        <w:rPr>
+          <w:rFonts w:ascii="Times New Roman" w:hAnsi="Times New Roman" w:cs="Times New Roman"/>
+          <w:sz w:val="28"/>
+          <w:szCs w:val="28"/>
+        </w:rPr>
+      </w:pPr>
+    </w:p>
+    <w:p>
+      <w:pPr>
+        <w:spacing w:line="360" w:lineRule="auto"/>
+        <w:jc w:val="center"/>
+        <w:rPr>
+          <w:rFonts w:ascii="Times New Roman" w:hAnsi="Times New Roman" w:cs="Times New Roman"/>
+          <w:sz w:val="28"/>
+          <w:szCs w:val="28"/>
+        </w:rPr>
+      </w:pPr>
       <w:r>
         <w:rPr>
           <w:rFonts w:ascii="Times New Roman" w:hAnsi="Times New Roman" w:cs="Times New Roman"/>
@@ -4292,6 +4439,43 @@
       <w:r>
         <w:rPr>
           <w:rFonts w:ascii="Times New Roman" w:hAnsi="Times New Roman" w:cs="Times New Roman"/>
+          <w:sz w:val="28"/>
+          <w:szCs w:val="28"/>
+        </w:rPr>
+        <w:t xml:space="preserve"> </w:t>
+      </w:r>
+    </w:p>
+    <w:p>
+      <w:pPr>
+        <w:spacing w:line="360" w:lineRule="auto"/>
+        <w:jc w:val="center"/>
+        <w:rPr>
+          <w:rFonts w:ascii="Times New Roman" w:hAnsi="Times New Roman" w:cs="Times New Roman"/>
+          <w:sz w:val="28"/>
+          <w:szCs w:val="28"/>
+        </w:rPr>
+      </w:pPr>
+      <w:r>
+        <w:rPr>
+          <w:rFonts w:ascii="Times New Roman" w:hAnsi="Times New Roman" w:cs="Times New Roman"/>
+          <w:sz w:val="28"/>
+          <w:szCs w:val="28"/>
+        </w:rPr>
+        <w:lastRenderedPageBreak/>
+        <w:t>Рисунок 2. Главная страница администратора</w:t>
+      </w:r>
+      <w:r>
+        <w:rPr>
+          <w:rFonts w:ascii="Times New Roman" w:hAnsi="Times New Roman" w:cs="Times New Roman"/>
+          <w:noProof/>
+          <w:sz w:val="28"/>
+          <w:szCs w:val="28"/>
+        </w:rPr>
+        <w:t xml:space="preserve"> </w:t>
+      </w:r>
+      <w:r>
+        <w:rPr>
+          <w:rFonts w:ascii="Times New Roman" w:hAnsi="Times New Roman" w:cs="Times New Roman"/>
           <w:noProof/>
           <w:sz w:val="28"/>
           <w:szCs w:val="28"/>
@@ -4338,6 +4522,47 @@
           </wp:inline>
         </w:drawing>
       </w:r>
+    </w:p>
+    <w:p>
+      <w:pPr>
+        <w:spacing w:line="360" w:lineRule="auto"/>
+        <w:jc w:val="center"/>
+        <w:rPr>
+          <w:rFonts w:ascii="Times New Roman" w:hAnsi="Times New Roman" w:cs="Times New Roman"/>
+          <w:sz w:val="28"/>
+          <w:szCs w:val="28"/>
+        </w:rPr>
+      </w:pPr>
+      <w:r>
+        <w:rPr>
+          <w:rFonts w:ascii="Times New Roman" w:hAnsi="Times New Roman" w:cs="Times New Roman"/>
+          <w:sz w:val="28"/>
+          <w:szCs w:val="28"/>
+        </w:rPr>
+        <w:t>Рисунок 3. Страница пользователей</w:t>
+      </w:r>
+    </w:p>
+    <w:p>
+      <w:pPr>
+        <w:spacing w:line="360" w:lineRule="auto"/>
+        <w:jc w:val="center"/>
+        <w:rPr>
+          <w:rFonts w:ascii="Times New Roman" w:hAnsi="Times New Roman" w:cs="Times New Roman"/>
+          <w:sz w:val="28"/>
+          <w:szCs w:val="28"/>
+        </w:rPr>
+      </w:pPr>
+    </w:p>
+    <w:p>
+      <w:pPr>
+        <w:spacing w:line="360" w:lineRule="auto"/>
+        <w:jc w:val="center"/>
+        <w:rPr>
+          <w:rFonts w:ascii="Times New Roman" w:hAnsi="Times New Roman" w:cs="Times New Roman"/>
+          <w:sz w:val="28"/>
+          <w:szCs w:val="28"/>
+        </w:rPr>
+      </w:pPr>
       <w:r>
         <w:rPr>
           <w:rFonts w:ascii="Times New Roman" w:hAnsi="Times New Roman" w:cs="Times New Roman"/>
@@ -4345,7 +4570,6 @@
           <w:sz w:val="28"/>
           <w:szCs w:val="28"/>
         </w:rPr>
-        <w:lastRenderedPageBreak/>
         <w:drawing>
           <wp:inline distT="0" distB="0" distL="0" distR="0" wp14:anchorId="0EA94E8C" wp14:editId="23AF68AA">
             <wp:extent cx="4972050" cy="2579300"/>
@@ -4388,6 +4612,46 @@
           </wp:inline>
         </w:drawing>
       </w:r>
+    </w:p>
+    <w:p>
+      <w:pPr>
+        <w:spacing w:line="360" w:lineRule="auto"/>
+        <w:jc w:val="center"/>
+        <w:rPr>
+          <w:rFonts w:ascii="Times New Roman" w:hAnsi="Times New Roman" w:cs="Times New Roman"/>
+          <w:sz w:val="28"/>
+          <w:szCs w:val="28"/>
+        </w:rPr>
+      </w:pPr>
+      <w:r>
+        <w:rPr>
+          <w:rFonts w:ascii="Times New Roman" w:hAnsi="Times New Roman" w:cs="Times New Roman"/>
+          <w:sz w:val="28"/>
+          <w:szCs w:val="28"/>
+        </w:rPr>
+        <w:t>Рисунок 4. Страница клиентов</w:t>
+      </w:r>
+    </w:p>
+    <w:p>
+      <w:pPr>
+        <w:spacing w:line="360" w:lineRule="auto"/>
+        <w:rPr>
+          <w:rFonts w:ascii="Times New Roman" w:hAnsi="Times New Roman" w:cs="Times New Roman"/>
+          <w:sz w:val="28"/>
+          <w:szCs w:val="28"/>
+        </w:rPr>
+      </w:pPr>
+    </w:p>
+    <w:p>
+      <w:pPr>
+        <w:spacing w:line="360" w:lineRule="auto"/>
+        <w:jc w:val="center"/>
+        <w:rPr>
+          <w:rFonts w:ascii="Times New Roman" w:hAnsi="Times New Roman" w:cs="Times New Roman"/>
+          <w:sz w:val="28"/>
+          <w:szCs w:val="28"/>
+        </w:rPr>
+      </w:pPr>
       <w:r>
         <w:rPr>
           <w:rFonts w:ascii="Times New Roman" w:hAnsi="Times New Roman" w:cs="Times New Roman"/>
@@ -4395,6 +4659,7 @@
           <w:sz w:val="28"/>
           <w:szCs w:val="28"/>
         </w:rPr>
+        <w:lastRenderedPageBreak/>
         <w:drawing>
           <wp:inline distT="0" distB="0" distL="0" distR="0" wp14:anchorId="43BA87B8" wp14:editId="57103433">
             <wp:extent cx="4991100" cy="2591851"/>
@@ -4436,6 +4701,25 @@
             </a:graphic>
           </wp:inline>
         </w:drawing>
+      </w:r>
+    </w:p>
+    <w:p>
+      <w:pPr>
+        <w:spacing w:line="360" w:lineRule="auto"/>
+        <w:jc w:val="center"/>
+        <w:rPr>
+          <w:rFonts w:ascii="Times New Roman" w:hAnsi="Times New Roman" w:cs="Times New Roman"/>
+          <w:sz w:val="28"/>
+          <w:szCs w:val="28"/>
+        </w:rPr>
+      </w:pPr>
+      <w:r>
+        <w:rPr>
+          <w:rFonts w:ascii="Times New Roman" w:hAnsi="Times New Roman" w:cs="Times New Roman"/>
+          <w:sz w:val="28"/>
+          <w:szCs w:val="28"/>
+        </w:rPr>
+        <w:t>Рисунок 5. Главная страница работника</w:t>
       </w:r>
     </w:p>
     <w:sectPr>
@@ -6306,6 +6590,7 @@
   <w:style w:type="character" w:default="1" w:styleId="DefaultParagraphFont">
     <w:name w:val="Default Paragraph Font"/>
     <w:uiPriority w:val="1"/>
+    <w:semiHidden/>
     <w:unhideWhenUsed/>
   </w:style>
   <w:style w:type="table" w:default="1" w:styleId="TableNormal">
@@ -6652,6 +6937,25 @@
     <w:uiPriority w:val="99"/>
     <w:rsid w:val="00AF17CB"/>
   </w:style>
+  <w:style w:type="table" w:styleId="TableGrid">
+    <w:name w:val="Table Grid"/>
+    <w:basedOn w:val="TableNormal"/>
+    <w:uiPriority w:val="39"/>
+    <w:rsid w:val="00FF38D5"/>
+    <w:pPr>
+      <w:spacing w:after="0" w:line="240" w:lineRule="auto"/>
+    </w:pPr>
+    <w:tblPr>
+      <w:tblBorders>
+        <w:top w:val="single" w:sz="4" w:space="0" w:color="auto"/>
+        <w:left w:val="single" w:sz="4" w:space="0" w:color="auto"/>
+        <w:bottom w:val="single" w:sz="4" w:space="0" w:color="auto"/>
+        <w:right w:val="single" w:sz="4" w:space="0" w:color="auto"/>
+        <w:insideH w:val="single" w:sz="4" w:space="0" w:color="auto"/>
+        <w:insideV w:val="single" w:sz="4" w:space="0" w:color="auto"/>
+      </w:tblBorders>
+    </w:tblPr>
+  </w:style>
 </w:styles>
 </file>
 

</xml_diff>